<commit_message>
Translate the Hong Kong overlay Word files into Traditional Chinese.
English headings, notes, and review flags are now 繁體中文; website copy strings are unchanged.

Co-authored-by: jackiechow4567-arch <jackiechow4567-arch@users.noreply.github.com>
</commit_message>
<xml_diff>
--- a/samples/mpnicare-hk-locale/word/MPNicare-HK-terms-privacy-rewrite.docx
+++ b/samples/mpnicare-hk-locale/word/MPNicare-HK-terms-privacy-rewrite.docx
@@ -10,7 +10,7 @@
           <w:color w:val="0B6E6E"/>
           <w:sz w:val="20"/>
         </w:rPr>
-        <w:t>MPNicare ｜ PharmaEssentia Hong Kong</w:t>
+        <w:t>MPNicare ｜ 藥華醫藥香港</w:t>
       </w:r>
     </w:p>
     <w:p>
@@ -21,7 +21,7 @@
           <w:color w:val="12353A"/>
           <w:sz w:val="40"/>
         </w:rPr>
-        <w:t>使用條款與私隱政策 — Hong Kong rewrite (legal review draft)</w:t>
+        <w:t>使用條款與私隱政策——香港重寫稿（法律審閱草稿）</w:t>
       </w:r>
     </w:p>
     <w:p>
@@ -34,7 +34,7 @@
           <w:b w:val="0"/>
           <w:sz w:val="22"/>
         </w:rPr>
-        <w:t>Not a find-and-replace of Taiwan《個人資料保護法》Arts. 3, 10 and 11. Rewrite under Hong Kong Cap. 486. Do not publish until Legal signs off.</w:t>
+        <w:t>不是把台灣《個人資料保護法》第3、10、11條逐字替換。須按香港法例第486章重寫。法務簽署前不得上線。</w:t>
       </w:r>
     </w:p>
     <w:p>
@@ -47,7 +47,7 @@
           <w:b w:val="0"/>
           <w:sz w:val="20"/>
         </w:rPr>
-        <w:t>Date: 21 August 2026  ·  Sensitivity: Low (public patient-education site)  ·  Status: implementation spec / legal-review draft</w:t>
+        <w:t>日期：2026年8月21日  ·  敏感度：低（公開病人教育網站）  ·  狀態：實作規格／法律審閱草稿</w:t>
       </w:r>
     </w:p>
     <w:p>
@@ -61,7 +61,7 @@
           <w:color w:val="12353A"/>
           <w:sz w:val="32"/>
         </w:rPr>
-        <w:t>1. Mapping from the current page</w:t>
+        <w:t>1. 現有頁面對照</w:t>
       </w:r>
     </w:p>
     <w:tbl>
@@ -90,7 +90,7 @@
                 <w:color w:val="FFFFFF"/>
                 <w:sz w:val="20"/>
               </w:rPr>
-              <w:t>Current (do not keep)</w:t>
+              <w:t>現有用字（不要保留）</w:t>
             </w:r>
           </w:p>
         </w:tc>
@@ -108,7 +108,7 @@
                 <w:color w:val="FFFFFF"/>
                 <w:sz w:val="20"/>
               </w:rPr>
-              <w:t>Hong Kong</w:t>
+              <w:t>香港用字</w:t>
             </w:r>
           </w:p>
         </w:tc>
@@ -194,7 +194,7 @@
                 <w:b w:val="0"/>
                 <w:sz w:val="20"/>
               </w:rPr>
-              <w:t>個人資料保護法第三條 / 第10條 / 第11條</w:t>
+              <w:t>個人資料保護法第三條／第10條／第11條</w:t>
             </w:r>
           </w:p>
         </w:tc>
@@ -210,7 +210,7 @@
                 <w:b w:val="0"/>
                 <w:sz w:val="20"/>
               </w:rPr>
-              <w:t>《個人資料（私隱）條例》(第486章) — data access s.18; correction s.22; refusal s.20 / s.24; fee s.28</w:t>
+              <w:t>《個人資料（私隱）條例》（第486章）——查閱資料第18條；改正第22條；拒絕第20／24條；費用第28條</w:t>
             </w:r>
           </w:p>
         </w:tc>
@@ -262,7 +262,7 @@
                 <w:b w:val="0"/>
                 <w:sz w:val="20"/>
               </w:rPr>
-              <w:t>藥華藥 and 藥華醫藥 mixed</w:t>
+              <w:t>「藥華藥」與「藥華醫藥」混用</w:t>
             </w:r>
           </w:p>
         </w:tc>
@@ -278,7 +278,7 @@
                 <w:b w:val="0"/>
                 <w:sz w:val="20"/>
               </w:rPr>
-              <w:t>PharmaEssentia 藥華醫藥 on first mention; 藥華醫藥 thereafter</w:t>
+              <w:t>首次寫 PharmaEssentia 藥華醫藥；其後一律「藥華醫藥」</w:t>
             </w:r>
           </w:p>
         </w:tc>
@@ -364,7 +364,7 @@
           <w:color w:val="12353A"/>
           <w:sz w:val="32"/>
         </w:rPr>
-        <w:t>2. Draft copy for the Hong Kong page</w:t>
+        <w:t>2. 香港頁面草稿全文</w:t>
       </w:r>
     </w:p>
     <w:p>
@@ -481,7 +481,7 @@
           <w:b w:val="0"/>
           <w:sz w:val="22"/>
         </w:rPr>
-        <w:t>您可向本公司提出：（一）查閱資料要求（Data Access Request，《條例》第18條）；以及（二）改正資料要求（Data Correction Request，《條例》第22條）。</w:t>
+        <w:t>您可向本公司提出：（一）查閱資料要求（《條例》第18條）；以及（二）改正資料要求（《條例》第22條）。</w:t>
       </w:r>
     </w:p>
     <w:p>
@@ -586,7 +586,7 @@
           <w:color w:val="12353A"/>
           <w:sz w:val="32"/>
         </w:rPr>
-        <w:t>3. Legal review flags</w:t>
+        <w:t>3. 法務審閱要點</w:t>
       </w:r>
     </w:p>
     <w:p>
@@ -599,7 +599,7 @@
           <w:b w:val="0"/>
           <w:sz w:val="22"/>
         </w:rPr>
-        <w:t>• Confirm data-access / correction / refusal / fee sections against current Cap. 486 and PCPD guidance.</w:t>
+        <w:t>• 核對查閱／改正／拒絕／費用條文，是否符合現行第486章及個人資料私隱專員公署指引。</w:t>
       </w:r>
     </w:p>
     <w:p>
@@ -612,7 +612,7 @@
           <w:b w:val="0"/>
           <w:sz w:val="22"/>
         </w:rPr>
-        <w:t>• Confirm whether a voluntary deletion / opt-out line should stay as company policy (not as a statutory PDPA Art. 3 right).</w:t>
+        <w:t>• 確認自願刪除／退出通訊的字句，應否保留為公司政策（而非台灣個資法第3條的法定權利）。</w:t>
       </w:r>
     </w:p>
     <w:p>
@@ -625,7 +625,7 @@
           <w:b w:val="0"/>
           <w:sz w:val="22"/>
         </w:rPr>
-        <w:t>• Confirm cross-border transfer wording for PharmaEssentia affiliates.</w:t>
+        <w:t>• 確認藥華醫藥附屬機構跨境傳送個人資料的用字。</w:t>
       </w:r>
     </w:p>
     <w:p>
@@ -638,7 +638,7 @@
           <w:b w:val="0"/>
           <w:sz w:val="22"/>
         </w:rPr>
-        <w:t>• UMAO (Cap. 231) is out of this file; chrome and labels to be checked separately when the user uploads the ordinance pack.</w:t>
+        <w:t>• 《不良廣告（醫藥）條例》（第231章）不在本檔範圍；待用戶上傳條例檔案後，另核介面用語及標示。</w:t>
       </w:r>
     </w:p>
     <w:p>
@@ -651,7 +651,7 @@
           <w:b w:val="0"/>
           <w:sz w:val="22"/>
         </w:rPr>
-        <w:t>• Do not publish this draft as the live privacy notice until Legal signs off.</w:t>
+        <w:t>• 法務簽署前，不得將本草稿作為正式私隱聲明上線。</w:t>
       </w:r>
     </w:p>
     <w:sectPr>

</xml_diff>